<commit_message>
Update URLs in DOCX files
</commit_message>
<xml_diff>
--- a/cs10/python/s01_intro.docx
+++ b/cs10/python/s01_intro.docx
@@ -55,12 +55,24 @@
       <w:r>
         <w:t xml:space="preserve">: </w:t>
       </w:r>
-      <w:hyperlink r:id="rId4" w:anchor="cs_new/sp1/intro">
+      <w:hyperlink r:id="rId6" w:anchor="cs/cs10/sp/intro">
         <w:r>
           <w:rPr>
             <w:rStyle w:val="Hyperlink"/>
           </w:rPr>
-          <w:t>dmaccarthy.github.io/</w:t>
+          <w:t>dmaccarthy.github</w:t>
+        </w:r>
+        <w:r>
+          <w:rPr>
+            <w:rStyle w:val="Hyperlink"/>
+          </w:rPr>
+          <w:t>.</w:t>
+        </w:r>
+        <w:r>
+          <w:rPr>
+            <w:rStyle w:val="Hyperlink"/>
+          </w:rPr>
+          <w:t>io/</w:t>
         </w:r>
         <w:proofErr w:type="gramStart"/>
         <w:r>
@@ -74,7 +86,7 @@
           <w:rPr>
             <w:rStyle w:val="Hyperlink"/>
           </w:rPr>
-          <w:t>cs_new/sp1/intro</w:t>
+          <w:t>cs/cs10/sp/intro</w:t>
         </w:r>
       </w:hyperlink>
     </w:p>
@@ -173,7 +185,6 @@
         <w:tc>
           <w:tcPr>
             <w:tcW w:w="1005" w:type="dxa"/>
-            <w:shd w:val="clear" w:color="auto" w:fill="auto"/>
             <w:tcMar>
               <w:top w:w="28" w:type="dxa"/>
               <w:left w:w="28" w:type="dxa"/>
@@ -213,7 +224,6 @@
         <w:tc>
           <w:tcPr>
             <w:tcW w:w="2655" w:type="dxa"/>
-            <w:shd w:val="clear" w:color="auto" w:fill="auto"/>
             <w:tcMar>
               <w:top w:w="28" w:type="dxa"/>
               <w:left w:w="28" w:type="dxa"/>
@@ -253,7 +263,6 @@
         <w:tc>
           <w:tcPr>
             <w:tcW w:w="5475" w:type="dxa"/>
-            <w:shd w:val="clear" w:color="auto" w:fill="auto"/>
             <w:tcMar>
               <w:top w:w="28" w:type="dxa"/>
               <w:left w:w="28" w:type="dxa"/>
@@ -298,7 +307,6 @@
         <w:tc>
           <w:tcPr>
             <w:tcW w:w="1005" w:type="dxa"/>
-            <w:shd w:val="clear" w:color="auto" w:fill="auto"/>
             <w:tcMar>
               <w:top w:w="28" w:type="dxa"/>
               <w:left w:w="28" w:type="dxa"/>
@@ -334,7 +342,6 @@
         <w:tc>
           <w:tcPr>
             <w:tcW w:w="2655" w:type="dxa"/>
-            <w:shd w:val="clear" w:color="auto" w:fill="auto"/>
             <w:tcMar>
               <w:top w:w="28" w:type="dxa"/>
               <w:left w:w="28" w:type="dxa"/>
@@ -365,7 +372,6 @@
         <w:tc>
           <w:tcPr>
             <w:tcW w:w="5475" w:type="dxa"/>
-            <w:shd w:val="clear" w:color="auto" w:fill="auto"/>
             <w:tcMar>
               <w:top w:w="28" w:type="dxa"/>
               <w:left w:w="28" w:type="dxa"/>
@@ -401,7 +407,6 @@
         <w:tc>
           <w:tcPr>
             <w:tcW w:w="1005" w:type="dxa"/>
-            <w:shd w:val="clear" w:color="auto" w:fill="auto"/>
             <w:tcMar>
               <w:top w:w="28" w:type="dxa"/>
               <w:left w:w="28" w:type="dxa"/>
@@ -437,7 +442,6 @@
         <w:tc>
           <w:tcPr>
             <w:tcW w:w="2655" w:type="dxa"/>
-            <w:shd w:val="clear" w:color="auto" w:fill="auto"/>
             <w:tcMar>
               <w:top w:w="28" w:type="dxa"/>
               <w:left w:w="28" w:type="dxa"/>
@@ -468,7 +472,6 @@
         <w:tc>
           <w:tcPr>
             <w:tcW w:w="5475" w:type="dxa"/>
-            <w:shd w:val="clear" w:color="auto" w:fill="auto"/>
             <w:tcMar>
               <w:top w:w="28" w:type="dxa"/>
               <w:left w:w="28" w:type="dxa"/>
@@ -504,7 +507,6 @@
         <w:tc>
           <w:tcPr>
             <w:tcW w:w="1005" w:type="dxa"/>
-            <w:shd w:val="clear" w:color="auto" w:fill="auto"/>
             <w:tcMar>
               <w:top w:w="28" w:type="dxa"/>
               <w:left w:w="28" w:type="dxa"/>
@@ -540,7 +542,6 @@
         <w:tc>
           <w:tcPr>
             <w:tcW w:w="2655" w:type="dxa"/>
-            <w:shd w:val="clear" w:color="auto" w:fill="auto"/>
             <w:tcMar>
               <w:top w:w="28" w:type="dxa"/>
               <w:left w:w="28" w:type="dxa"/>
@@ -571,7 +572,6 @@
         <w:tc>
           <w:tcPr>
             <w:tcW w:w="5475" w:type="dxa"/>
-            <w:shd w:val="clear" w:color="auto" w:fill="auto"/>
             <w:tcMar>
               <w:top w:w="28" w:type="dxa"/>
               <w:left w:w="28" w:type="dxa"/>
@@ -607,7 +607,6 @@
         <w:tc>
           <w:tcPr>
             <w:tcW w:w="1005" w:type="dxa"/>
-            <w:shd w:val="clear" w:color="auto" w:fill="auto"/>
             <w:tcMar>
               <w:top w:w="28" w:type="dxa"/>
               <w:left w:w="28" w:type="dxa"/>
@@ -643,7 +642,6 @@
         <w:tc>
           <w:tcPr>
             <w:tcW w:w="2655" w:type="dxa"/>
-            <w:shd w:val="clear" w:color="auto" w:fill="auto"/>
             <w:tcMar>
               <w:top w:w="28" w:type="dxa"/>
               <w:left w:w="28" w:type="dxa"/>
@@ -674,7 +672,6 @@
         <w:tc>
           <w:tcPr>
             <w:tcW w:w="5475" w:type="dxa"/>
-            <w:shd w:val="clear" w:color="auto" w:fill="auto"/>
             <w:tcMar>
               <w:top w:w="28" w:type="dxa"/>
               <w:left w:w="28" w:type="dxa"/>
@@ -710,7 +707,6 @@
         <w:tc>
           <w:tcPr>
             <w:tcW w:w="1005" w:type="dxa"/>
-            <w:shd w:val="clear" w:color="auto" w:fill="auto"/>
             <w:tcMar>
               <w:top w:w="28" w:type="dxa"/>
               <w:left w:w="28" w:type="dxa"/>
@@ -746,7 +742,6 @@
         <w:tc>
           <w:tcPr>
             <w:tcW w:w="2655" w:type="dxa"/>
-            <w:shd w:val="clear" w:color="auto" w:fill="auto"/>
             <w:tcMar>
               <w:top w:w="28" w:type="dxa"/>
               <w:left w:w="28" w:type="dxa"/>
@@ -777,7 +772,6 @@
         <w:tc>
           <w:tcPr>
             <w:tcW w:w="5475" w:type="dxa"/>
-            <w:shd w:val="clear" w:color="auto" w:fill="auto"/>
             <w:tcMar>
               <w:top w:w="28" w:type="dxa"/>
               <w:left w:w="28" w:type="dxa"/>
@@ -813,7 +807,6 @@
         <w:tc>
           <w:tcPr>
             <w:tcW w:w="1005" w:type="dxa"/>
-            <w:shd w:val="clear" w:color="auto" w:fill="auto"/>
             <w:tcMar>
               <w:top w:w="28" w:type="dxa"/>
               <w:left w:w="28" w:type="dxa"/>
@@ -849,7 +842,6 @@
         <w:tc>
           <w:tcPr>
             <w:tcW w:w="2655" w:type="dxa"/>
-            <w:shd w:val="clear" w:color="auto" w:fill="auto"/>
             <w:tcMar>
               <w:top w:w="28" w:type="dxa"/>
               <w:left w:w="28" w:type="dxa"/>
@@ -880,7 +872,6 @@
         <w:tc>
           <w:tcPr>
             <w:tcW w:w="5475" w:type="dxa"/>
-            <w:shd w:val="clear" w:color="auto" w:fill="auto"/>
             <w:tcMar>
               <w:top w:w="28" w:type="dxa"/>
               <w:left w:w="28" w:type="dxa"/>
@@ -916,7 +907,6 @@
         <w:tc>
           <w:tcPr>
             <w:tcW w:w="1005" w:type="dxa"/>
-            <w:shd w:val="clear" w:color="auto" w:fill="auto"/>
             <w:tcMar>
               <w:top w:w="28" w:type="dxa"/>
               <w:left w:w="28" w:type="dxa"/>
@@ -952,7 +942,6 @@
         <w:tc>
           <w:tcPr>
             <w:tcW w:w="2655" w:type="dxa"/>
-            <w:shd w:val="clear" w:color="auto" w:fill="auto"/>
             <w:tcMar>
               <w:top w:w="28" w:type="dxa"/>
               <w:left w:w="28" w:type="dxa"/>
@@ -983,7 +972,6 @@
         <w:tc>
           <w:tcPr>
             <w:tcW w:w="5475" w:type="dxa"/>
-            <w:shd w:val="clear" w:color="auto" w:fill="auto"/>
             <w:tcMar>
               <w:top w:w="28" w:type="dxa"/>
               <w:left w:w="28" w:type="dxa"/>
@@ -1019,7 +1007,6 @@
         <w:tc>
           <w:tcPr>
             <w:tcW w:w="1005" w:type="dxa"/>
-            <w:shd w:val="clear" w:color="auto" w:fill="auto"/>
             <w:tcMar>
               <w:top w:w="28" w:type="dxa"/>
               <w:left w:w="28" w:type="dxa"/>
@@ -1055,7 +1042,6 @@
         <w:tc>
           <w:tcPr>
             <w:tcW w:w="2655" w:type="dxa"/>
-            <w:shd w:val="clear" w:color="auto" w:fill="auto"/>
             <w:tcMar>
               <w:top w:w="28" w:type="dxa"/>
               <w:left w:w="28" w:type="dxa"/>
@@ -1086,7 +1072,6 @@
         <w:tc>
           <w:tcPr>
             <w:tcW w:w="5475" w:type="dxa"/>
-            <w:shd w:val="clear" w:color="auto" w:fill="auto"/>
             <w:tcMar>
               <w:top w:w="28" w:type="dxa"/>
               <w:left w:w="28" w:type="dxa"/>
@@ -1122,7 +1107,6 @@
         <w:tc>
           <w:tcPr>
             <w:tcW w:w="1005" w:type="dxa"/>
-            <w:shd w:val="clear" w:color="auto" w:fill="auto"/>
             <w:tcMar>
               <w:top w:w="28" w:type="dxa"/>
               <w:left w:w="28" w:type="dxa"/>
@@ -1158,7 +1142,6 @@
         <w:tc>
           <w:tcPr>
             <w:tcW w:w="2655" w:type="dxa"/>
-            <w:shd w:val="clear" w:color="auto" w:fill="auto"/>
             <w:tcMar>
               <w:top w:w="28" w:type="dxa"/>
               <w:left w:w="28" w:type="dxa"/>
@@ -1189,7 +1172,6 @@
         <w:tc>
           <w:tcPr>
             <w:tcW w:w="5475" w:type="dxa"/>
-            <w:shd w:val="clear" w:color="auto" w:fill="auto"/>
             <w:tcMar>
               <w:top w:w="28" w:type="dxa"/>
               <w:left w:w="28" w:type="dxa"/>
@@ -1225,7 +1207,6 @@
         <w:tc>
           <w:tcPr>
             <w:tcW w:w="1005" w:type="dxa"/>
-            <w:shd w:val="clear" w:color="auto" w:fill="auto"/>
             <w:tcMar>
               <w:top w:w="28" w:type="dxa"/>
               <w:left w:w="28" w:type="dxa"/>
@@ -1261,7 +1242,6 @@
         <w:tc>
           <w:tcPr>
             <w:tcW w:w="2655" w:type="dxa"/>
-            <w:shd w:val="clear" w:color="auto" w:fill="auto"/>
             <w:tcMar>
               <w:top w:w="28" w:type="dxa"/>
               <w:left w:w="28" w:type="dxa"/>
@@ -1292,7 +1272,6 @@
         <w:tc>
           <w:tcPr>
             <w:tcW w:w="5475" w:type="dxa"/>
-            <w:shd w:val="clear" w:color="auto" w:fill="auto"/>
             <w:tcMar>
               <w:top w:w="28" w:type="dxa"/>
               <w:left w:w="28" w:type="dxa"/>
@@ -1411,8 +1390,8 @@
     </w:p>
     <w:p/>
     <w:sectPr>
-      <w:footerReference w:type="default" r:id="rId5"/>
-      <w:footerReference w:type="first" r:id="rId6"/>
+      <w:footerReference w:type="default" r:id="rId7"/>
+      <w:footerReference w:type="first" r:id="rId8"/>
       <w:pgSz w:w="12240" w:h="15840"/>
       <w:pgMar w:top="1440" w:right="1080" w:bottom="1440" w:left="1080" w:header="0" w:footer="720" w:gutter="0"/>
       <w:pgNumType w:start="1"/>
@@ -1421,6 +1400,31 @@
     </w:sectPr>
   </w:body>
 </w:document>
+</file>
+
+<file path=word/endnotes.xml><?xml version="1.0" encoding="utf-8"?>
+<w:endnotes xmlns:wpc="http://schemas.microsoft.com/office/word/2010/wordprocessingCanvas" xmlns:cx="http://schemas.microsoft.com/office/drawing/2014/chartex" xmlns:cx1="http://schemas.microsoft.com/office/drawing/2015/9/8/chartex" xmlns:cx2="http://schemas.microsoft.com/office/drawing/2015/10/21/chartex" xmlns:cx3="http://schemas.microsoft.com/office/drawing/2016/5/9/chartex" xmlns:cx4="http://schemas.microsoft.com/office/drawing/2016/5/10/chartex" xmlns:cx5="http://schemas.microsoft.com/office/drawing/2016/5/11/chartex" xmlns:cx6="http://schemas.microsoft.com/office/drawing/2016/5/12/chartex" xmlns:cx7="http://schemas.microsoft.com/office/drawing/2016/5/13/chartex" xmlns:cx8="http://schemas.microsoft.com/office/drawing/2016/5/14/chartex" xmlns:mc="http://schemas.openxmlformats.org/markup-compatibility/2006" xmlns:aink="http://schemas.microsoft.com/office/drawing/2016/ink" xmlns:am3d="http://schemas.microsoft.com/office/drawing/2017/model3d" xmlns:o="urn:schemas-microsoft-com:office:office" xmlns:oel="http://schemas.microsoft.com/office/2019/extlst" xmlns:r="http://schemas.openxmlformats.org/officeDocument/2006/relationships" xmlns:m="http://schemas.openxmlformats.org/officeDocument/2006/math" xmlns:v="urn:schemas-microsoft-com:vml" xmlns:wp14="http://schemas.microsoft.com/office/word/2010/wordprocessingDrawing" xmlns:wp="http://schemas.openxmlformats.org/drawingml/2006/wordprocessingDrawing" xmlns:w10="urn:schemas-microsoft-com:office:word" xmlns:w="http://schemas.openxmlformats.org/wordprocessingml/2006/main" xmlns:w14="http://schemas.microsoft.com/office/word/2010/wordml" xmlns:w15="http://schemas.microsoft.com/office/word/2012/wordml" xmlns:w16cex="http://schemas.microsoft.com/office/word/2018/wordml/cex" xmlns:w16cid="http://schemas.microsoft.com/office/word/2016/wordml/cid" xmlns:w16="http://schemas.microsoft.com/office/word/2018/wordml" xmlns:w16du="http://schemas.microsoft.com/office/word/2023/wordml/word16du" xmlns:w16sdtdh="http://schemas.microsoft.com/office/word/2020/wordml/sdtdatahash" xmlns:w16sdtfl="http://schemas.microsoft.com/office/word/2024/wordml/sdtformatlock" xmlns:w16se="http://schemas.microsoft.com/office/word/2015/wordml/symex" xmlns:wpg="http://schemas.microsoft.com/office/word/2010/wordprocessingGroup" xmlns:wpi="http://schemas.microsoft.com/office/word/2010/wordprocessingInk" xmlns:wne="http://schemas.microsoft.com/office/word/2006/wordml" xmlns:wps="http://schemas.microsoft.com/office/word/2010/wordprocessingShape" mc:Ignorable="w14 w15 w16se w16cid w16 w16cex w16sdtdh w16sdtfl w16du wp14">
+  <w:endnote w:type="separator" w:id="-1">
+    <w:p>
+      <w:pPr>
+        <w:spacing w:after="0"/>
+      </w:pPr>
+      <w:r>
+        <w:separator/>
+      </w:r>
+    </w:p>
+  </w:endnote>
+  <w:endnote w:type="continuationSeparator" w:id="0">
+    <w:p>
+      <w:pPr>
+        <w:spacing w:after="0"/>
+      </w:pPr>
+      <w:r>
+        <w:continuationSeparator/>
+      </w:r>
+    </w:p>
+  </w:endnote>
+</w:endnotes>
 </file>
 
 <file path=word/footer1.xml><?xml version="1.0" encoding="utf-8"?>
@@ -1460,6 +1464,31 @@
     </w:pPr>
   </w:p>
 </w:ftr>
+</file>
+
+<file path=word/footnotes.xml><?xml version="1.0" encoding="utf-8"?>
+<w:footnotes xmlns:wpc="http://schemas.microsoft.com/office/word/2010/wordprocessingCanvas" xmlns:cx="http://schemas.microsoft.com/office/drawing/2014/chartex" xmlns:cx1="http://schemas.microsoft.com/office/drawing/2015/9/8/chartex" xmlns:cx2="http://schemas.microsoft.com/office/drawing/2015/10/21/chartex" xmlns:cx3="http://schemas.microsoft.com/office/drawing/2016/5/9/chartex" xmlns:cx4="http://schemas.microsoft.com/office/drawing/2016/5/10/chartex" xmlns:cx5="http://schemas.microsoft.com/office/drawing/2016/5/11/chartex" xmlns:cx6="http://schemas.microsoft.com/office/drawing/2016/5/12/chartex" xmlns:cx7="http://schemas.microsoft.com/office/drawing/2016/5/13/chartex" xmlns:cx8="http://schemas.microsoft.com/office/drawing/2016/5/14/chartex" xmlns:mc="http://schemas.openxmlformats.org/markup-compatibility/2006" xmlns:aink="http://schemas.microsoft.com/office/drawing/2016/ink" xmlns:am3d="http://schemas.microsoft.com/office/drawing/2017/model3d" xmlns:o="urn:schemas-microsoft-com:office:office" xmlns:oel="http://schemas.microsoft.com/office/2019/extlst" xmlns:r="http://schemas.openxmlformats.org/officeDocument/2006/relationships" xmlns:m="http://schemas.openxmlformats.org/officeDocument/2006/math" xmlns:v="urn:schemas-microsoft-com:vml" xmlns:wp14="http://schemas.microsoft.com/office/word/2010/wordprocessingDrawing" xmlns:wp="http://schemas.openxmlformats.org/drawingml/2006/wordprocessingDrawing" xmlns:w10="urn:schemas-microsoft-com:office:word" xmlns:w="http://schemas.openxmlformats.org/wordprocessingml/2006/main" xmlns:w14="http://schemas.microsoft.com/office/word/2010/wordml" xmlns:w15="http://schemas.microsoft.com/office/word/2012/wordml" xmlns:w16cex="http://schemas.microsoft.com/office/word/2018/wordml/cex" xmlns:w16cid="http://schemas.microsoft.com/office/word/2016/wordml/cid" xmlns:w16="http://schemas.microsoft.com/office/word/2018/wordml" xmlns:w16du="http://schemas.microsoft.com/office/word/2023/wordml/word16du" xmlns:w16sdtdh="http://schemas.microsoft.com/office/word/2020/wordml/sdtdatahash" xmlns:w16sdtfl="http://schemas.microsoft.com/office/word/2024/wordml/sdtformatlock" xmlns:w16se="http://schemas.microsoft.com/office/word/2015/wordml/symex" xmlns:wpg="http://schemas.microsoft.com/office/word/2010/wordprocessingGroup" xmlns:wpi="http://schemas.microsoft.com/office/word/2010/wordprocessingInk" xmlns:wne="http://schemas.microsoft.com/office/word/2006/wordml" xmlns:wps="http://schemas.microsoft.com/office/word/2010/wordprocessingShape" mc:Ignorable="w14 w15 w16se w16cid w16 w16cex w16sdtdh w16sdtfl w16du wp14">
+  <w:footnote w:type="separator" w:id="-1">
+    <w:p>
+      <w:pPr>
+        <w:spacing w:after="0"/>
+      </w:pPr>
+      <w:r>
+        <w:separator/>
+      </w:r>
+    </w:p>
+  </w:footnote>
+  <w:footnote w:type="continuationSeparator" w:id="0">
+    <w:p>
+      <w:pPr>
+        <w:spacing w:after="0"/>
+      </w:pPr>
+      <w:r>
+        <w:continuationSeparator/>
+      </w:r>
+    </w:p>
+  </w:footnote>
+</w:footnotes>
 </file>
 
 <file path=word/styles.xml><?xml version="1.0" encoding="utf-8"?>
@@ -2508,6 +2537,18 @@
       <w:u w:val="single"/>
     </w:rPr>
   </w:style>
+  <w:style w:type="character" w:styleId="FollowedHyperlink">
+    <w:name w:val="FollowedHyperlink"/>
+    <w:basedOn w:val="DefaultParagraphFont"/>
+    <w:uiPriority w:val="99"/>
+    <w:semiHidden/>
+    <w:unhideWhenUsed/>
+    <w:rsid w:val="00B345D5"/>
+    <w:rPr>
+      <w:color w:val="96607D" w:themeColor="followedHyperlink"/>
+      <w:u w:val="single"/>
+    </w:rPr>
+  </w:style>
 </w:styles>
 </file>
 

</xml_diff>